<commit_message>
docs: sync references and sealed progress
</commit_message>
<xml_diff>
--- a/docs/reference/04-Database-Design.md.docx
+++ b/docs/reference/04-Database-Design.md.docx
@@ -33,29 +33,29 @@
           <w:rFonts w:ascii="Arial Unicode MS" w:cs="Arial Unicode MS" w:eastAsia="Arial Unicode MS" w:hAnsi="Arial Unicode MS"/>
           <w:rtl w:val="0"/>
         </w:rPr>
-        <w:t xml:space="preserve">## Database Design 建置與規劃 v2.4</w:t>
-      </w:r>
-    </w:p>
-    <w:p>
-      <w:pPr>
-        <w:rPr/>
-      </w:pPr>
-      <w:r>
-        <w:rPr>
-          <w:rtl w:val="0"/>
-        </w:rPr>
-      </w:r>
-    </w:p>
-    <w:p>
-      <w:pPr>
-        <w:rPr/>
-      </w:pPr>
-      <w:r>
-        <w:rPr>
-          <w:rFonts w:ascii="Arial Unicode MS" w:cs="Arial Unicode MS" w:eastAsia="Arial Unicode MS" w:hAnsi="Arial Unicode MS"/>
-          <w:rtl w:val="0"/>
-        </w:rPr>
-        <w:t xml:space="preserve">文件狀態：Design Baseline Approved／04 Review Gate PASS／Open Enrollment Backfill PASS</w:t>
+        <w:t xml:space="preserve">## Database Design 建置與規劃 v2.5</w:t>
+      </w:r>
+    </w:p>
+    <w:p>
+      <w:pPr>
+        <w:rPr/>
+      </w:pPr>
+      <w:r>
+        <w:rPr>
+          <w:rtl w:val="0"/>
+        </w:rPr>
+      </w:r>
+    </w:p>
+    <w:p>
+      <w:pPr>
+        <w:rPr/>
+      </w:pPr>
+      <w:r>
+        <w:rPr>
+          <w:rFonts w:ascii="Arial Unicode MS" w:cs="Arial Unicode MS" w:eastAsia="Arial Unicode MS" w:hAnsi="Arial Unicode MS"/>
+          <w:rtl w:val="0"/>
+        </w:rPr>
+        <w:t xml:space="preserve">文件狀態：Design Baseline Approved／04 Review Gate PASS／Open Enrollment Backfill PASS／Slice 2 Baseline Backfill PASS</w:t>
       </w:r>
     </w:p>
     <w:p>
@@ -21755,7 +21755,7 @@
           <w:rFonts w:ascii="Arial Unicode MS" w:cs="Arial Unicode MS" w:eastAsia="Arial Unicode MS" w:hAnsi="Arial Unicode MS"/>
           <w:rtl w:val="0"/>
         </w:rPr>
-        <w:t xml:space="preserve">正式採用本 v2.2 Core MVP Schema 作為 04 Approved Baseline。</w:t>
+        <w:t xml:space="preserve">正式採用本文件目前 Approved Baseline（含後續 Addendum）作為 04 Core MVP Schema 實作基線。</w:t>
       </w:r>
     </w:p>
     <w:p>
@@ -22962,7 +22962,7 @@
           <w:rFonts w:ascii="Arial Unicode MS" w:cs="Arial Unicode MS" w:eastAsia="Arial Unicode MS" w:hAnsi="Arial Unicode MS"/>
           <w:rtl w:val="0"/>
         </w:rPr>
-        <w:t xml:space="preserve">文件結論：本版 `04-Database-Design.md v2.4` 已依目前 `chatgpt` 資料夾中的 PRD、Business Rules、System Architecture、MVP 補充文件、進度控管與歷史 v1 設計完成整併。核心差異是把 Coach Availability Proposal、Lesson Request、Course Match 正式拆分，補入 Enrollment／Member Cancellation、Coach Cancellation Request、Refund Approval/Execution、Settlement Adjustment 與完整 BR Traceability。本次已完成 04-1～04-6 Review Gate，可進入 05 Domain Model、Permission Matrix 與 API Specification。</w:t>
+        <w:t xml:space="preserve">文件結論：本版 `04-Database-Design.md` 已依目前 `chatgpt` 資料夾中的 PRD、Business Rules、System Architecture、MVP 補充文件、進度控管與歷史 v1 設計完成整併，並持續以後續 Addendum 補強已核准 Baseline。核心差異是把 Coach Availability Proposal、Lesson Request、Course Match 正式拆分，補入 Enrollment／Member Cancellation、Coach Cancellation Request、Refund Approval/Execution、Settlement Adjustment 與完整 BR Traceability。本次已完成 04-1～04-6 Review Gate，可進入 05 Domain Model、Permission Matrix 與 API Specification。</w:t>
       </w:r>
     </w:p>
     <w:p>
@@ -26796,6 +26796,689 @@
           <w:rtl w:val="0"/>
         </w:rPr>
         <w:t xml:space="preserve">Slice 2 Persistence Baseline 對上述四項決策完成對齊。Codex 實作時不得以舊 05/06/07 摘要覆蓋本章；若仍發現 schema 缺口，依 Approved Baseline 文件保護流程回報，不自行改規格。</w:t>
+      </w:r>
+    </w:p>
+    <w:p>
+      <w:pPr>
+        <w:rPr/>
+      </w:pPr>
+      <w:r>
+        <w:rPr>
+          <w:rtl w:val="0"/>
+        </w:rPr>
+      </w:r>
+    </w:p>
+    <w:p>
+      <w:pPr>
+        <w:rPr/>
+      </w:pPr>
+      <w:r>
+        <w:rPr>
+          <w:rtl w:val="0"/>
+        </w:rPr>
+      </w:r>
+    </w:p>
+    <w:p>
+      <w:pPr>
+        <w:rPr/>
+      </w:pPr>
+      <w:r>
+        <w:rPr>
+          <w:rtl w:val="0"/>
+        </w:rPr>
+        <w:t xml:space="preserve">## 21.8 Lesson Request Selected Availability Draft Persistence</w:t>
+      </w:r>
+    </w:p>
+    <w:p>
+      <w:pPr>
+        <w:rPr/>
+      </w:pPr>
+      <w:r>
+        <w:rPr>
+          <w:rtl w:val="0"/>
+        </w:rPr>
+      </w:r>
+    </w:p>
+    <w:p>
+      <w:pPr>
+        <w:rPr/>
+      </w:pPr>
+      <w:r>
+        <w:rPr>
+          <w:rFonts w:ascii="Arial Unicode MS" w:cs="Arial Unicode MS" w:eastAsia="Arial Unicode MS" w:hAnsi="Arial Unicode MS"/>
+          <w:rtl w:val="0"/>
+        </w:rPr>
+        <w:t xml:space="preserve">為解決 06 API Spec 與 Slice 2 實作之間的 draft persistence 缺口，`lesson_requests` 新增以下 nullable 欄位，作為學員在 DRAFT 階段選擇公開 Coach Availability Proposal 的 canonical persistence：</w:t>
+      </w:r>
+    </w:p>
+    <w:p>
+      <w:pPr>
+        <w:rPr/>
+      </w:pPr>
+      <w:r>
+        <w:rPr>
+          <w:rtl w:val="0"/>
+        </w:rPr>
+      </w:r>
+    </w:p>
+    <w:p>
+      <w:pPr>
+        <w:rPr/>
+      </w:pPr>
+      <w:r>
+        <w:rPr>
+          <w:rFonts w:ascii="Arial Unicode MS" w:cs="Arial Unicode MS" w:eastAsia="Arial Unicode MS" w:hAnsi="Arial Unicode MS"/>
+          <w:rtl w:val="0"/>
+        </w:rPr>
+        <w:t xml:space="preserve">| 欄位 | 型別 | Null | Key / Default | 說明 |</w:t>
+      </w:r>
+    </w:p>
+    <w:p>
+      <w:pPr>
+        <w:rPr/>
+      </w:pPr>
+      <w:r>
+        <w:rPr>
+          <w:rtl w:val="0"/>
+        </w:rPr>
+        <w:t xml:space="preserve">|---|---|---:|---|---|</w:t>
+      </w:r>
+    </w:p>
+    <w:p>
+      <w:pPr>
+        <w:rPr/>
+      </w:pPr>
+      <w:r>
+        <w:rPr>
+          <w:rFonts w:ascii="Arial Unicode MS" w:cs="Arial Unicode MS" w:eastAsia="Arial Unicode MS" w:hAnsi="Arial Unicode MS"/>
+          <w:rtl w:val="0"/>
+        </w:rPr>
+        <w:t xml:space="preserve">| selected_availability_proposal_id | uuid | YES | FK coach_availability_proposals.id | DRAFT 階段選擇的公開 Availability Proposal；NULL 表示一般 Lesson Request |</w:t>
+      </w:r>
+    </w:p>
+    <w:p>
+      <w:pPr>
+        <w:rPr/>
+      </w:pPr>
+      <w:r>
+        <w:rPr>
+          <w:rtl w:val="0"/>
+        </w:rPr>
+      </w:r>
+    </w:p>
+    <w:p>
+      <w:pPr>
+        <w:rPr/>
+      </w:pPr>
+      <w:r>
+        <w:rPr>
+          <w:rFonts w:ascii="Arial Unicode MS" w:cs="Arial Unicode MS" w:eastAsia="Arial Unicode MS" w:hAnsi="Arial Unicode MS"/>
+          <w:rtl w:val="0"/>
+        </w:rPr>
+        <w:t xml:space="preserve">Foreign Key：</w:t>
+      </w:r>
+    </w:p>
+    <w:p>
+      <w:pPr>
+        <w:rPr/>
+      </w:pPr>
+      <w:r>
+        <w:rPr>
+          <w:rFonts w:ascii="Arial Unicode MS" w:cs="Arial Unicode MS" w:eastAsia="Arial Unicode MS" w:hAnsi="Arial Unicode MS"/>
+          <w:rtl w:val="0"/>
+        </w:rPr>
+        <w:t xml:space="preserve">- `fk_lesson_requests_selected_availability_proposal_id` → `coach_availability_proposals(id)`，ON DELETE RESTRICT。</w:t>
+      </w:r>
+    </w:p>
+    <w:p>
+      <w:pPr>
+        <w:rPr/>
+      </w:pPr>
+      <w:r>
+        <w:rPr>
+          <w:rtl w:val="0"/>
+        </w:rPr>
+      </w:r>
+    </w:p>
+    <w:p>
+      <w:pPr>
+        <w:rPr/>
+      </w:pPr>
+      <w:r>
+        <w:rPr>
+          <w:rFonts w:ascii="Arial Unicode MS" w:cs="Arial Unicode MS" w:eastAsia="Arial Unicode MS" w:hAnsi="Arial Unicode MS"/>
+          <w:rtl w:val="0"/>
+        </w:rPr>
+        <w:t xml:space="preserve">Index：</w:t>
+      </w:r>
+    </w:p>
+    <w:p>
+      <w:pPr>
+        <w:rPr/>
+      </w:pPr>
+      <w:r>
+        <w:rPr>
+          <w:rFonts w:ascii="Arial Unicode MS" w:cs="Arial Unicode MS" w:eastAsia="Arial Unicode MS" w:hAnsi="Arial Unicode MS"/>
+          <w:rtl w:val="0"/>
+        </w:rPr>
+        <w:t xml:space="preserve">- `idx_lesson_requests_selected_availability_proposal(selected_availability_proposal_id) WHERE selected_availability_proposal_id IS NOT NULL`。</w:t>
+      </w:r>
+    </w:p>
+    <w:p>
+      <w:pPr>
+        <w:rPr/>
+      </w:pPr>
+      <w:r>
+        <w:rPr>
+          <w:rFonts w:ascii="Arial Unicode MS" w:cs="Arial Unicode MS" w:eastAsia="Arial Unicode MS" w:hAnsi="Arial Unicode MS"/>
+          <w:rtl w:val="0"/>
+        </w:rPr>
+        <w:t xml:space="preserve">- 不建立 UNIQUE；DRAFT 階段多筆 Lesson Request 可以暫時選到同一 Proposal，真正的競爭控制仍由 `coach_availability_claims` 的 ACTIVE Claim Partial UNIQUE 負責。</w:t>
+      </w:r>
+    </w:p>
+    <w:p>
+      <w:pPr>
+        <w:rPr/>
+      </w:pPr>
+      <w:r>
+        <w:rPr>
+          <w:rtl w:val="0"/>
+        </w:rPr>
+      </w:r>
+    </w:p>
+    <w:p>
+      <w:pPr>
+        <w:rPr/>
+      </w:pPr>
+      <w:r>
+        <w:rPr>
+          <w:rFonts w:ascii="Arial Unicode MS" w:cs="Arial Unicode MS" w:eastAsia="Arial Unicode MS" w:hAnsi="Arial Unicode MS"/>
+          <w:rtl w:val="0"/>
+        </w:rPr>
+        <w:t xml:space="preserve">Canonical Rules：</w:t>
+      </w:r>
+    </w:p>
+    <w:p>
+      <w:pPr>
+        <w:rPr/>
+      </w:pPr>
+      <w:r>
+        <w:rPr>
+          <w:rFonts w:ascii="Arial Unicode MS" w:cs="Arial Unicode MS" w:eastAsia="Arial Unicode MS" w:hAnsi="Arial Unicode MS"/>
+          <w:rtl w:val="0"/>
+        </w:rPr>
+        <w:t xml:space="preserve">1. 僅 `lesson_requests.status='DRAFT'` 時允許選擇、更換或清除 `selected_availability_proposal_id`；進入 SUBMITTED 後不得一般 PATCH 改寫。</w:t>
+      </w:r>
+    </w:p>
+    <w:p>
+      <w:pPr>
+        <w:rPr/>
+      </w:pPr>
+      <w:r>
+        <w:rPr>
+          <w:rFonts w:ascii="Arial Unicode MS" w:cs="Arial Unicode MS" w:eastAsia="Arial Unicode MS" w:hAnsi="Arial Unicode MS"/>
+          <w:rtl w:val="0"/>
+        </w:rPr>
+        <w:t xml:space="preserve">2. 非 NULL 時，Proposal 必須與 Lesson Request 屬於同一 organization，且 proposal `status='APPROVED'`。</w:t>
+      </w:r>
+    </w:p>
+    <w:p>
+      <w:pPr>
+        <w:rPr/>
+      </w:pPr>
+      <w:r>
+        <w:rPr>
+          <w:rFonts w:ascii="Arial Unicode MS" w:cs="Arial Unicode MS" w:eastAsia="Arial Unicode MS" w:hAnsi="Arial Unicode MS"/>
+          <w:rtl w:val="0"/>
+        </w:rPr>
+        <w:t xml:space="preserve">3. `preferred_coach_profile_id` 必須與 selected Proposal 的 `coach_profile_id` 一致；Backend 不接受互相矛盾的 coach / proposal mass assignment。</w:t>
+      </w:r>
+    </w:p>
+    <w:p>
+      <w:pPr>
+        <w:rPr/>
+      </w:pPr>
+      <w:r>
+        <w:rPr>
+          <w:rFonts w:ascii="Arial Unicode MS" w:cs="Arial Unicode MS" w:eastAsia="Arial Unicode MS" w:hAnsi="Arial Unicode MS"/>
+          <w:rtl w:val="0"/>
+        </w:rPr>
+        <w:t xml:space="preserve">4. Draft update 可以從 request payload 接受 `selectedAvailabilityProposalId`，但 Lesson Request Submission 必須以資料庫中已持久化的 `selected_availability_proposal_id` 為 canonical source，不以 Submit request 臨時傳入的未持久化值取代。</w:t>
+      </w:r>
+    </w:p>
+    <w:p>
+      <w:pPr>
+        <w:rPr/>
+      </w:pPr>
+      <w:r>
+        <w:rPr>
+          <w:rFonts w:ascii="Arial Unicode MS" w:cs="Arial Unicode MS" w:eastAsia="Arial Unicode MS" w:hAnsi="Arial Unicode MS"/>
+          <w:rtl w:val="0"/>
+        </w:rPr>
+        <w:t xml:space="preserve">5. 若 `selected_availability_proposal_id IS NULL`，Submission 為一般 Lesson Request 提交，不建立 Availability Claim。</w:t>
+      </w:r>
+    </w:p>
+    <w:p>
+      <w:pPr>
+        <w:rPr/>
+      </w:pPr>
+      <w:r>
+        <w:rPr>
+          <w:rFonts w:ascii="Arial Unicode MS" w:cs="Arial Unicode MS" w:eastAsia="Arial Unicode MS" w:hAnsi="Arial Unicode MS"/>
+          <w:rtl w:val="0"/>
+        </w:rPr>
+        <w:t xml:space="preserve">6. 若 `selected_availability_proposal_id IS NOT NULL`，Lesson Request `DRAFT → SUBMITTED` 與 `coach_availability_claims(status='ACTIVE')` INSERT 必須在同一 transaction 完成。</w:t>
+      </w:r>
+    </w:p>
+    <w:p>
+      <w:pPr>
+        <w:rPr/>
+      </w:pPr>
+      <w:r>
+        <w:rPr>
+          <w:rFonts w:ascii="Arial Unicode MS" w:cs="Arial Unicode MS" w:eastAsia="Arial Unicode MS" w:hAnsi="Arial Unicode MS"/>
+          <w:rtl w:val="0"/>
+        </w:rPr>
+        <w:t xml:space="preserve">7. Claim 建立前必須 lock / re-read 目標 Proposal，重新驗證 APPROVED、未過期、CoachProfile/COACH role 有效與 organization scope。</w:t>
+      </w:r>
+    </w:p>
+    <w:p>
+      <w:pPr>
+        <w:rPr/>
+      </w:pPr>
+      <w:r>
+        <w:rPr>
+          <w:rFonts w:ascii="Arial Unicode MS" w:cs="Arial Unicode MS" w:eastAsia="Arial Unicode MS" w:hAnsi="Arial Unicode MS"/>
+          <w:rtl w:val="0"/>
+        </w:rPr>
+        <w:t xml:space="preserve">8. ACTIVE Claim Partial UNIQUE 衝突時，整筆 Submission transaction rollback，Lesson Request 不得留下假 `SUBMITTED` 狀態，API 回傳 `AVAILABILITY_ALREADY_CLAIMED`。</w:t>
+      </w:r>
+    </w:p>
+    <w:p>
+      <w:pPr>
+        <w:rPr/>
+      </w:pPr>
+      <w:r>
+        <w:rPr>
+          <w:rFonts w:ascii="Arial Unicode MS" w:cs="Arial Unicode MS" w:eastAsia="Arial Unicode MS" w:hAnsi="Arial Unicode MS"/>
+          <w:rtl w:val="0"/>
+        </w:rPr>
+        <w:t xml:space="preserve">9. Submission 成功後保留 `selected_availability_proposal_id` 作為原始需求來源 trace；後續 Claim 的 ACTIVE/RELEASED/CLOSED/CONVERTED 狀態代表實際占用生命週期，兩者語意不同。</w:t>
+      </w:r>
+    </w:p>
+    <w:p>
+      <w:pPr>
+        <w:rPr/>
+      </w:pPr>
+      <w:r>
+        <w:rPr>
+          <w:rFonts w:ascii="Arial Unicode MS" w:cs="Arial Unicode MS" w:eastAsia="Arial Unicode MS" w:hAnsi="Arial Unicode MS"/>
+          <w:rtl w:val="0"/>
+        </w:rPr>
+        <w:t xml:space="preserve">10. Idempotent retry 必須沿用既有 Lesson Request Submission `Idempotency-Key` 規則；相同成功 request 不得建立第二筆 Claim。</w:t>
+      </w:r>
+    </w:p>
+    <w:p>
+      <w:pPr>
+        <w:rPr/>
+      </w:pPr>
+      <w:r>
+        <w:rPr>
+          <w:rtl w:val="0"/>
+        </w:rPr>
+      </w:r>
+    </w:p>
+    <w:p>
+      <w:pPr>
+        <w:rPr/>
+      </w:pPr>
+      <w:r>
+        <w:rPr>
+          <w:rtl w:val="0"/>
+        </w:rPr>
+        <w:t xml:space="preserve">### 21.8.1 Table / Constraint / Concurrency Test Addendum</w:t>
+      </w:r>
+    </w:p>
+    <w:p>
+      <w:pPr>
+        <w:rPr/>
+      </w:pPr>
+      <w:r>
+        <w:rPr>
+          <w:rtl w:val="0"/>
+        </w:rPr>
+      </w:r>
+    </w:p>
+    <w:p>
+      <w:pPr>
+        <w:rPr/>
+      </w:pPr>
+      <w:r>
+        <w:rPr>
+          <w:rFonts w:ascii="Arial Unicode MS" w:cs="Arial Unicode MS" w:eastAsia="Arial Unicode MS" w:hAnsi="Arial Unicode MS"/>
+          <w:rtl w:val="0"/>
+        </w:rPr>
+        <w:t xml:space="preserve">至少新增：</w:t>
+      </w:r>
+    </w:p>
+    <w:p>
+      <w:pPr>
+        <w:rPr/>
+      </w:pPr>
+      <w:r>
+        <w:rPr>
+          <w:rFonts w:ascii="Arial Unicode MS" w:cs="Arial Unicode MS" w:eastAsia="Arial Unicode MS" w:hAnsi="Arial Unicode MS"/>
+          <w:rtl w:val="0"/>
+        </w:rPr>
+        <w:t xml:space="preserve">- DRAFT 可 set / replace / clear selected Availability；SUBMITTED 後不可一般修改。</w:t>
+      </w:r>
+    </w:p>
+    <w:p>
+      <w:pPr>
+        <w:rPr/>
+      </w:pPr>
+      <w:r>
+        <w:rPr>
+          <w:rFonts w:ascii="Arial Unicode MS" w:cs="Arial Unicode MS" w:eastAsia="Arial Unicode MS" w:hAnsi="Arial Unicode MS"/>
+          <w:rtl w:val="0"/>
+        </w:rPr>
+        <w:t xml:space="preserve">- selected Proposal 與 Lesson Request organization 不同時拒絕。</w:t>
+      </w:r>
+    </w:p>
+    <w:p>
+      <w:pPr>
+        <w:rPr/>
+      </w:pPr>
+      <w:r>
+        <w:rPr>
+          <w:rFonts w:ascii="Arial Unicode MS" w:cs="Arial Unicode MS" w:eastAsia="Arial Unicode MS" w:hAnsi="Arial Unicode MS"/>
+          <w:rtl w:val="0"/>
+        </w:rPr>
+        <w:t xml:space="preserve">- selected Proposal 與 `preferred_coach_profile_id` 不一致時拒絕。</w:t>
+      </w:r>
+    </w:p>
+    <w:p>
+      <w:pPr>
+        <w:rPr/>
+      </w:pPr>
+      <w:r>
+        <w:rPr>
+          <w:rFonts w:ascii="Arial Unicode MS" w:cs="Arial Unicode MS" w:eastAsia="Arial Unicode MS" w:hAnsi="Arial Unicode MS"/>
+          <w:rtl w:val="0"/>
+        </w:rPr>
+        <w:t xml:space="preserve">- Proposal 非 APPROVED 或開始時間已不在未來時，Submit 不建立 Claim 並 rollback。</w:t>
+      </w:r>
+    </w:p>
+    <w:p>
+      <w:pPr>
+        <w:rPr/>
+      </w:pPr>
+      <w:r>
+        <w:rPr>
+          <w:rFonts w:ascii="Arial Unicode MS" w:cs="Arial Unicode MS" w:eastAsia="Arial Unicode MS" w:hAnsi="Arial Unicode MS"/>
+          <w:rtl w:val="0"/>
+        </w:rPr>
+        <w:t xml:space="preserve">- 兩名學員各自持有指向同一 Proposal 的 DRAFT Lesson Request 可以同時存在。</w:t>
+      </w:r>
+    </w:p>
+    <w:p>
+      <w:pPr>
+        <w:rPr/>
+      </w:pPr>
+      <w:r>
+        <w:rPr>
+          <w:rFonts w:ascii="Arial Unicode MS" w:cs="Arial Unicode MS" w:eastAsia="Arial Unicode MS" w:hAnsi="Arial Unicode MS"/>
+          <w:rtl w:val="0"/>
+        </w:rPr>
+        <w:t xml:space="preserve">- 兩名學員同時 Submit 指向同一 APPROVED Proposal 時，只有一筆 transaction 成功建立 ACTIVE Claim；另一筆回傳 `AVAILABILITY_ALREADY_CLAIMED`，且其 Lesson Request 保持原可重試狀態而非假 SUBMITTED。</w:t>
+      </w:r>
+    </w:p>
+    <w:p>
+      <w:pPr>
+        <w:rPr/>
+      </w:pPr>
+      <w:r>
+        <w:rPr>
+          <w:rFonts w:ascii="Arial Unicode MS" w:cs="Arial Unicode MS" w:eastAsia="Arial Unicode MS" w:hAnsi="Arial Unicode MS"/>
+          <w:rtl w:val="0"/>
+        </w:rPr>
+        <w:t xml:space="preserve">- 相同 Idempotency-Key retry 不建立重複 Claim。</w:t>
+      </w:r>
+    </w:p>
+    <w:p>
+      <w:pPr>
+        <w:rPr/>
+      </w:pPr>
+      <w:r>
+        <w:rPr>
+          <w:rtl w:val="0"/>
+        </w:rPr>
+      </w:r>
+    </w:p>
+    <w:p>
+      <w:pPr>
+        <w:rPr/>
+      </w:pPr>
+      <w:r>
+        <w:rPr>
+          <w:rtl w:val="0"/>
+        </w:rPr>
+        <w:t xml:space="preserve">## 21.9 Venue Master Migration Dependency Clarification</w:t>
+      </w:r>
+    </w:p>
+    <w:p>
+      <w:pPr>
+        <w:rPr/>
+      </w:pPr>
+      <w:r>
+        <w:rPr>
+          <w:rtl w:val="0"/>
+        </w:rPr>
+      </w:r>
+    </w:p>
+    <w:p>
+      <w:pPr>
+        <w:rPr/>
+      </w:pPr>
+      <w:r>
+        <w:rPr>
+          <w:rFonts w:ascii="Arial Unicode MS" w:cs="Arial Unicode MS" w:eastAsia="Arial Unicode MS" w:hAnsi="Arial Unicode MS"/>
+          <w:rtl w:val="0"/>
+        </w:rPr>
+        <w:t xml:space="preserve">`coach_availability_proposals.preferred_venue_id` 與 `lesson_request_session_preferences.preferred_venue_id` 仍維持既有正式 FK → `venues(id)`；Slice 2 不採「nullable UUID 但延後 Venue FK」作法。</w:t>
+      </w:r>
+    </w:p>
+    <w:p>
+      <w:pPr>
+        <w:rPr/>
+      </w:pPr>
+      <w:r>
+        <w:rPr>
+          <w:rtl w:val="0"/>
+        </w:rPr>
+      </w:r>
+    </w:p>
+    <w:p>
+      <w:pPr>
+        <w:rPr/>
+      </w:pPr>
+      <w:r>
+        <w:rPr>
+          <w:rFonts w:ascii="Arial Unicode MS" w:cs="Arial Unicode MS" w:eastAsia="Arial Unicode MS" w:hAnsi="Arial Unicode MS"/>
+          <w:rtl w:val="0"/>
+        </w:rPr>
+        <w:t xml:space="preserve">Migration Rules：</w:t>
+      </w:r>
+    </w:p>
+    <w:p>
+      <w:pPr>
+        <w:rPr/>
+      </w:pPr>
+      <w:r>
+        <w:rPr>
+          <w:rFonts w:ascii="Arial Unicode MS" w:cs="Arial Unicode MS" w:eastAsia="Arial Unicode MS" w:hAnsi="Arial Unicode MS"/>
+          <w:rtl w:val="0"/>
+        </w:rPr>
+        <w:t xml:space="preserve">1. Repository 若尚未有 `venues` table，必須先使用下一個可用 Flyway migration 建立既有 04 §5.5.1 `venues` Master，再建立或補上 Slice 2 的 Venue FK。</w:t>
+      </w:r>
+    </w:p>
+    <w:p>
+      <w:pPr>
+        <w:rPr/>
+      </w:pPr>
+      <w:r>
+        <w:rPr>
+          <w:rFonts w:ascii="Arial Unicode MS" w:cs="Arial Unicode MS" w:eastAsia="Arial Unicode MS" w:hAnsi="Arial Unicode MS"/>
+          <w:rtl w:val="0"/>
+        </w:rPr>
+        <w:t xml:space="preserve">2. 若目前 Slice 2 migration 尚未 merge / 尚未成為不可改寫的 migration history，可依實際 next-version 重新整理 migration sequencing，使 Venue Master migration 位於 Coach Availability / Lesson Preference migration 之前。</w:t>
+      </w:r>
+    </w:p>
+    <w:p>
+      <w:pPr>
+        <w:rPr/>
+      </w:pPr>
+      <w:r>
+        <w:rPr>
+          <w:rFonts w:ascii="Arial Unicode MS" w:cs="Arial Unicode MS" w:eastAsia="Arial Unicode MS" w:hAnsi="Arial Unicode MS"/>
+          <w:rtl w:val="0"/>
+        </w:rPr>
+        <w:t xml:space="preserve">3. 若相關 migration 已進 main 或已部署，不得重寫既有 migration；改用新的 forward-only migration 建立 `venues` / 補 FK，並確保 empty PostgreSQL 可由 migration history 全量 migrate 成功。</w:t>
+      </w:r>
+    </w:p>
+    <w:p>
+      <w:pPr>
+        <w:rPr/>
+      </w:pPr>
+      <w:r>
+        <w:rPr>
+          <w:rFonts w:ascii="Arial Unicode MS" w:cs="Arial Unicode MS" w:eastAsia="Arial Unicode MS" w:hAnsi="Arial Unicode MS"/>
+          <w:rtl w:val="0"/>
+        </w:rPr>
+        <w:t xml:space="preserve">4. 不得為了解決 Venue FK 而移除既有 FK 契約，也不得以 application-only validation 取代資料庫 referential integrity。</w:t>
+      </w:r>
+    </w:p>
+    <w:p>
+      <w:pPr>
+        <w:rPr/>
+      </w:pPr>
+      <w:r>
+        <w:rPr>
+          <w:rFonts w:ascii="Arial Unicode MS" w:cs="Arial Unicode MS" w:eastAsia="Arial Unicode MS" w:hAnsi="Arial Unicode MS"/>
+          <w:rtl w:val="0"/>
+        </w:rPr>
+        <w:t xml:space="preserve">5. 所有 FK / Index 名稱仍依本文件 Naming 規則；至少驗證 `preferred_venue_id` 指向不存在 Venue 時由 DB 拒絕，NULL 則允許。</w:t>
+      </w:r>
+    </w:p>
+    <w:p>
+      <w:pPr>
+        <w:rPr/>
+      </w:pPr>
+      <w:r>
+        <w:rPr>
+          <w:rtl w:val="0"/>
+        </w:rPr>
+      </w:r>
+    </w:p>
+    <w:p>
+      <w:pPr>
+        <w:rPr/>
+      </w:pPr>
+      <w:r>
+        <w:rPr>
+          <w:rtl w:val="0"/>
+        </w:rPr>
+        <w:t xml:space="preserve">## 21.10 Slice 2 Baseline Backfill Review Result</w:t>
+      </w:r>
+    </w:p>
+    <w:p>
+      <w:pPr>
+        <w:rPr/>
+      </w:pPr>
+      <w:r>
+        <w:rPr>
+          <w:rtl w:val="0"/>
+        </w:rPr>
+      </w:r>
+    </w:p>
+    <w:p>
+      <w:pPr>
+        <w:rPr/>
+      </w:pPr>
+      <w:r>
+        <w:rPr>
+          <w:rFonts w:ascii="Arial Unicode MS" w:cs="Arial Unicode MS" w:eastAsia="Arial Unicode MS" w:hAnsi="Arial Unicode MS"/>
+          <w:rtl w:val="0"/>
+        </w:rPr>
+        <w:t xml:space="preserve">Slice 2 Baseline Backfill：PASS。</w:t>
+      </w:r>
+    </w:p>
+    <w:p>
+      <w:pPr>
+        <w:rPr/>
+      </w:pPr>
+      <w:r>
+        <w:rPr>
+          <w:rtl w:val="0"/>
+        </w:rPr>
+      </w:r>
+    </w:p>
+    <w:p>
+      <w:pPr>
+        <w:rPr/>
+      </w:pPr>
+      <w:r>
+        <w:rPr>
+          <w:rFonts w:ascii="Arial Unicode MS" w:cs="Arial Unicode MS" w:eastAsia="Arial Unicode MS" w:hAnsi="Arial Unicode MS"/>
+          <w:rtl w:val="0"/>
+        </w:rPr>
+        <w:t xml:space="preserve">本次最小 Backfill 僅補兩項已確認的 implementation gap：</w:t>
+      </w:r>
+    </w:p>
+    <w:p>
+      <w:pPr>
+        <w:rPr/>
+      </w:pPr>
+      <w:r>
+        <w:rPr>
+          <w:rFonts w:ascii="Arial Unicode MS" w:cs="Arial Unicode MS" w:eastAsia="Arial Unicode MS" w:hAnsi="Arial Unicode MS"/>
+          <w:rtl w:val="0"/>
+        </w:rPr>
+        <w:t xml:space="preserve">- `lesson_requests.selected_availability_proposal_id`：補足 DRAFT → Submission 的公開 Availability 選擇持久化與 Claim transaction canonical source。</w:t>
+      </w:r>
+    </w:p>
+    <w:p>
+      <w:pPr>
+        <w:rPr/>
+      </w:pPr>
+      <w:r>
+        <w:rPr>
+          <w:rFonts w:ascii="Arial Unicode MS" w:cs="Arial Unicode MS" w:eastAsia="Arial Unicode MS" w:hAnsi="Arial Unicode MS"/>
+          <w:rtl w:val="0"/>
+        </w:rPr>
+        <w:t xml:space="preserve">- Venue Master migration dependency：確認既有 Venue FK 不延後、不移除，透過正確 Flyway sequencing / forward-fix 解決。</w:t>
+      </w:r>
+    </w:p>
+    <w:p>
+      <w:pPr>
+        <w:rPr/>
+      </w:pPr>
+      <w:r>
+        <w:rPr>
+          <w:rtl w:val="0"/>
+        </w:rPr>
+      </w:r>
+    </w:p>
+    <w:p>
+      <w:pPr>
+        <w:rPr/>
+      </w:pPr>
+      <w:r>
+        <w:rPr>
+          <w:rFonts w:ascii="Arial Unicode MS" w:cs="Arial Unicode MS" w:eastAsia="Arial Unicode MS" w:hAnsi="Arial Unicode MS"/>
+          <w:rtl w:val="0"/>
+        </w:rPr>
+        <w:t xml:space="preserve">既有 04 Domain Boundary、Availability Claim first-success rule、06 API Contract、08 Test Strategy 與 10 Development Vertical Slice 順序均維持不變。Codex 應從目前 Slice 2 工作成果接續實作，不得重新初始化 Slice 2、不得重寫 Approved Baseline 既有決策，亦不得為完成 acceptance 自行發明新的 persistence model。</w:t>
       </w:r>
     </w:p>
     <w:p>

</xml_diff>